<commit_message>
docs: final update to help and user documentation
</commit_message>
<xml_diff>
--- a/docs/Help Document.docx
+++ b/docs/Help Document.docx
@@ -18,6 +18,7 @@
       <w:sdtContent>
         <w:p>
           <w:pPr>
+            <w:jc w:val="center"/>
             <w:rPr>
               <w:b/>
               <w:bCs/>
@@ -47,6 +48,7 @@
         </w:p>
         <w:p>
           <w:pPr>
+            <w:jc w:val="center"/>
             <w:rPr>
               <w:sz w:val="36"/>
               <w:szCs w:val="32"/>
@@ -64,6 +66,7 @@
         </w:p>
         <w:p>
           <w:pPr>
+            <w:jc w:val="center"/>
             <w:rPr>
               <w:lang w:val="en-US"/>
             </w:rPr>
@@ -82,6 +85,13 @@
             </w:rPr>
           </w:pPr>
         </w:p>
+        <w:p>
+          <w:pPr>
+            <w:rPr>
+              <w:lang w:val="en-US"/>
+            </w:rPr>
+          </w:pPr>
+        </w:p>
       </w:sdtContent>
     </w:sdt>
     <w:p>
@@ -167,6 +177,11 @@
     </w:p>
     <w:p>
       <w:pPr>
+        <w:ind w:left="1440"/>
+      </w:pPr>
+    </w:p>
+    <w:p>
+      <w:pPr>
         <w:rPr>
           <w:b/>
           <w:bCs/>
@@ -220,7 +235,13 @@
         <w:t>you</w:t>
       </w:r>
       <w:r>
-        <w:t xml:space="preserve"> authored. If the "Edit" button is missing, you are viewing an artifact deposited by another archivist.</w:t>
+        <w:t xml:space="preserve"> </w:t>
+      </w:r>
+      <w:r>
+        <w:t>created</w:t>
+      </w:r>
+      <w:r>
+        <w:t>. If the "Edit" button is missing, you are viewing an artifact deposited by another archivist.</w:t>
       </w:r>
     </w:p>
     <w:p>
@@ -266,6 +287,11 @@
     </w:p>
     <w:p>
       <w:pPr>
+        <w:ind w:left="1440"/>
+      </w:pPr>
+    </w:p>
+    <w:p>
+      <w:pPr>
         <w:rPr>
           <w:b/>
           <w:bCs/>
@@ -357,6 +383,385 @@
     </w:p>
     <w:p>
       <w:pPr>
+        <w:ind w:left="1440"/>
+      </w:pPr>
+    </w:p>
+    <w:p>
+      <w:pPr>
+        <w:rPr>
+          <w:b/>
+          <w:bCs/>
+        </w:rPr>
+      </w:pPr>
+      <w:r>
+        <w:rPr>
+          <w:b/>
+          <w:bCs/>
+        </w:rPr>
+        <w:t>4. Advanced Search &amp; Content Discovery</w:t>
+      </w:r>
+    </w:p>
+    <w:p>
+      <w:pPr>
+        <w:pStyle w:val="ListParagraph"/>
+        <w:numPr>
+          <w:ilvl w:val="0"/>
+          <w:numId w:val="8"/>
+        </w:numPr>
+        <w:rPr>
+          <w:b/>
+          <w:bCs/>
+        </w:rPr>
+      </w:pPr>
+      <w:r>
+        <w:rPr>
+          <w:b/>
+          <w:bCs/>
+        </w:rPr>
+        <w:t>Q: I searched for "Breakfast" but only some recipes appeared. Why?</w:t>
+      </w:r>
+    </w:p>
+    <w:p>
+      <w:pPr>
+        <w:pStyle w:val="ListParagraph"/>
+        <w:numPr>
+          <w:ilvl w:val="0"/>
+          <w:numId w:val="14"/>
+        </w:numPr>
+        <w:rPr>
+          <w:b/>
+          <w:bCs/>
+        </w:rPr>
+      </w:pPr>
+      <w:r>
+        <w:rPr>
+          <w:b/>
+          <w:bCs/>
+        </w:rPr>
+        <w:lastRenderedPageBreak/>
+        <w:t xml:space="preserve">A: </w:t>
+      </w:r>
+      <w:r>
+        <w:t>The Global Search Bar prioritizes keywords found in the Recipe Name and Description. If a recipe is categorized as "Breakfast" but doesn't have the word in its title or summary, it may not appear in a keyword search. To see every entry for a category, use the "Daily Recipes" dropdown menu instead.</w:t>
+      </w:r>
+    </w:p>
+    <w:p>
+      <w:pPr>
+        <w:pStyle w:val="ListParagraph"/>
+        <w:ind w:left="1440"/>
+        <w:rPr>
+          <w:b/>
+          <w:bCs/>
+        </w:rPr>
+      </w:pPr>
+    </w:p>
+    <w:p>
+      <w:pPr>
+        <w:rPr>
+          <w:b/>
+          <w:bCs/>
+        </w:rPr>
+      </w:pPr>
+      <w:r>
+        <w:rPr>
+          <w:b/>
+          <w:bCs/>
+        </w:rPr>
+        <w:t>5. Data Integrity &amp; Submission</w:t>
+      </w:r>
+    </w:p>
+    <w:p>
+      <w:pPr>
+        <w:pStyle w:val="ListParagraph"/>
+        <w:numPr>
+          <w:ilvl w:val="0"/>
+          <w:numId w:val="8"/>
+        </w:numPr>
+        <w:rPr>
+          <w:b/>
+          <w:bCs/>
+        </w:rPr>
+      </w:pPr>
+      <w:r>
+        <w:rPr>
+          <w:b/>
+          <w:bCs/>
+        </w:rPr>
+        <w:t>Q: I submitted a recipe, but it isn’t showing up in the "Dinner" section.</w:t>
+      </w:r>
+    </w:p>
+    <w:p>
+      <w:pPr>
+        <w:pStyle w:val="ListParagraph"/>
+        <w:numPr>
+          <w:ilvl w:val="0"/>
+          <w:numId w:val="14"/>
+        </w:numPr>
+        <w:rPr>
+          <w:b/>
+          <w:bCs/>
+        </w:rPr>
+      </w:pPr>
+      <w:r>
+        <w:rPr>
+          <w:b/>
+          <w:bCs/>
+        </w:rPr>
+        <w:t xml:space="preserve">A: </w:t>
+      </w:r>
+      <w:r>
+        <w:t>This usually happens if the Subcategory was not selected during the upload process. Every artifact must be assigned both a primary Category (e.g., Daily Recipes) and a Subcategory (e.g., Dinner) to be indexed correctly on the filtered archive shelves. You can fix this by visiting your Profile, selecting the recipe, and clicking "Edit."</w:t>
+      </w:r>
+    </w:p>
+    <w:p>
+      <w:pPr>
+        <w:pStyle w:val="ListParagraph"/>
+        <w:ind w:left="1440"/>
+        <w:rPr>
+          <w:b/>
+          <w:bCs/>
+        </w:rPr>
+      </w:pPr>
+    </w:p>
+    <w:p>
+      <w:pPr>
+        <w:rPr>
+          <w:b/>
+          <w:bCs/>
+        </w:rPr>
+      </w:pPr>
+      <w:r>
+        <w:rPr>
+          <w:b/>
+          <w:bCs/>
+        </w:rPr>
+        <w:t>6. Technical Compatibility</w:t>
+      </w:r>
+    </w:p>
+    <w:p>
+      <w:pPr>
+        <w:pStyle w:val="ListParagraph"/>
+        <w:numPr>
+          <w:ilvl w:val="0"/>
+          <w:numId w:val="8"/>
+        </w:numPr>
+        <w:rPr>
+          <w:b/>
+          <w:bCs/>
+        </w:rPr>
+      </w:pPr>
+      <w:r>
+        <w:rPr>
+          <w:b/>
+          <w:bCs/>
+        </w:rPr>
+        <w:t>Q: The "Chef's Special" video is blank or showing a "Loading" icon.</w:t>
+      </w:r>
+    </w:p>
+    <w:p>
+      <w:pPr>
+        <w:pStyle w:val="ListParagraph"/>
+        <w:numPr>
+          <w:ilvl w:val="0"/>
+          <w:numId w:val="14"/>
+        </w:numPr>
+        <w:rPr>
+          <w:b/>
+          <w:bCs/>
+        </w:rPr>
+      </w:pPr>
+      <w:r>
+        <w:rPr>
+          <w:b/>
+          <w:bCs/>
+        </w:rPr>
+        <w:t xml:space="preserve">A: </w:t>
+      </w:r>
+      <w:r>
+        <w:t xml:space="preserve">The Vault utilizes </w:t>
+      </w:r>
+      <w:r>
+        <w:t>high definition</w:t>
+      </w:r>
+      <w:r>
+        <w:t xml:space="preserve"> .mp4 video loops. If the video fails to load, ensure you are not using a "Data Saver" mode on your browser, as this often blocks auto-playing media. For the best experience, we recommend using the latest version of Chrome or Edge, as they fully support the cinematic </w:t>
+      </w:r>
+      <w:r>
+        <w:t>glass morphism</w:t>
+      </w:r>
+      <w:r>
+        <w:t xml:space="preserve"> layers used in the Hero Section.</w:t>
+      </w:r>
+    </w:p>
+    <w:p>
+      <w:pPr>
+        <w:rPr>
+          <w:b/>
+          <w:bCs/>
+        </w:rPr>
+      </w:pPr>
+      <w:r>
+        <w:rPr>
+          <w:b/>
+          <w:bCs/>
+        </w:rPr>
+        <w:t>7. Escalation &amp; Developer Support</w:t>
+      </w:r>
+    </w:p>
+    <w:p>
+      <w:r>
+        <w:rPr>
+          <w:b/>
+          <w:bCs/>
+        </w:rPr>
+        <w:t>Q: I’ve read the FAQs, but my issue is still unresolved. Who can I contact?</w:t>
+      </w:r>
+    </w:p>
+    <w:p>
+      <w:pPr>
+        <w:pStyle w:val="ListParagraph"/>
+        <w:numPr>
+          <w:ilvl w:val="0"/>
+          <w:numId w:val="14"/>
+        </w:numPr>
+      </w:pPr>
+      <w:r>
+        <w:rPr>
+          <w:b/>
+          <w:bCs/>
+        </w:rPr>
+        <w:t>A:</w:t>
+      </w:r>
+      <w:r>
+        <w:t xml:space="preserve"> If your query remains unmet or you encounter a critical system error (such as a Database Connection Failure), please contact the </w:t>
+      </w:r>
+      <w:r>
+        <w:rPr>
+          <w:b/>
+          <w:bCs/>
+        </w:rPr>
+        <w:t>Lead Archivist</w:t>
+      </w:r>
+      <w:r>
+        <w:t xml:space="preserve"> directly. Our technical team is available for repository maintenance and troubleshooting during standard business hours</w:t>
+      </w:r>
+    </w:p>
+    <w:p/>
+    <w:p>
+      <w:pPr>
+        <w:jc w:val="center"/>
+        <w:rPr>
+          <w:b/>
+          <w:bCs/>
+          <w:sz w:val="40"/>
+          <w:szCs w:val="36"/>
+        </w:rPr>
+      </w:pPr>
+      <w:r>
+        <w:rPr>
+          <w:b/>
+          <w:bCs/>
+          <w:sz w:val="40"/>
+          <w:szCs w:val="36"/>
+        </w:rPr>
+        <w:t>CONTACT:</w:t>
+      </w:r>
+    </w:p>
+    <w:p>
+      <w:pPr>
+        <w:ind w:left="360"/>
+      </w:pPr>
+      <w:r>
+        <w:rPr>
+          <w:b/>
+          <w:bCs/>
+        </w:rPr>
+        <w:t>Lead Developer:</w:t>
+      </w:r>
+      <w:r>
+        <w:t xml:space="preserve"> Seanoa Ilaoa</w:t>
+      </w:r>
+    </w:p>
+    <w:p>
+      <w:pPr>
+        <w:ind w:left="360"/>
+      </w:pPr>
+      <w:r>
+        <w:rPr>
+          <w:b/>
+          <w:bCs/>
+        </w:rPr>
+        <w:t>Technical Support Email:</w:t>
+      </w:r>
+      <w:r>
+        <w:t xml:space="preserve"> </w:t>
+      </w:r>
+      <w:r>
+        <w:t>seanoa@whiskymail.com</w:t>
+      </w:r>
+    </w:p>
+    <w:p>
+      <w:pPr>
+        <w:ind w:left="360"/>
+      </w:pPr>
+      <w:r>
+        <w:rPr>
+          <w:b/>
+          <w:bCs/>
+        </w:rPr>
+        <w:t>Issue Reporting:</w:t>
+      </w:r>
+      <w:r>
+        <w:t xml:space="preserve"> Please provide a screenshot of the error and the steps taken leading up to the issue.</w:t>
+      </w:r>
+    </w:p>
+    <w:p>
+      <w:pPr>
+        <w:ind w:left="360"/>
+      </w:pPr>
+      <w:r>
+        <w:rPr>
+          <w:b/>
+          <w:bCs/>
+        </w:rPr>
+        <w:t>Professional Portfolio:</w:t>
+      </w:r>
+      <w:r>
+        <w:t xml:space="preserve"> </w:t>
+      </w:r>
+      <w:hyperlink r:id="rId5" w:history="1">
+        <w:r>
+          <w:rPr>
+            <w:rStyle w:val="Hyperlink"/>
+            <w:b/>
+            <w:bCs/>
+          </w:rPr>
+          <w:t>linkedin.com/in/seanoa-ilaoa-lio-b10522137</w:t>
+        </w:r>
+      </w:hyperlink>
+    </w:p>
+    <w:p>
+      <w:pPr>
+        <w:ind w:left="360"/>
+      </w:pPr>
+      <w:r>
+        <w:rPr>
+          <w:b/>
+          <w:bCs/>
+        </w:rPr>
+        <w:t>Source Code Queries:</w:t>
+      </w:r>
+      <w:r>
+        <w:t xml:space="preserve"> </w:t>
+      </w:r>
+      <w:r>
+        <w:t>https://github.com/si8168/Whisky_Project.git</w:t>
+      </w:r>
+    </w:p>
+    <w:p/>
+    <w:p>
+      <w:pPr>
+        <w:spacing w:line="240" w:lineRule="auto"/>
         <w:rPr>
           <w:lang w:val="en-US"/>
         </w:rPr>
@@ -364,6 +769,7 @@
     </w:p>
     <w:p>
       <w:pPr>
+        <w:spacing w:line="240" w:lineRule="auto"/>
         <w:rPr>
           <w:lang w:val="en-US"/>
         </w:rPr>
@@ -373,10 +779,6 @@
       <w:pPr>
         <w:spacing w:line="240" w:lineRule="auto"/>
         <w:rPr>
-          <w:rFonts w:asciiTheme="majorHAnsi" w:eastAsiaTheme="majorEastAsia" w:hAnsiTheme="majorHAnsi" w:cstheme="majorBidi"/>
-          <w:color w:val="2F5496" w:themeColor="accent1" w:themeShade="BF"/>
-          <w:sz w:val="40"/>
-          <w:szCs w:val="40"/>
           <w:lang w:val="en-US"/>
         </w:rPr>
       </w:pPr>
@@ -385,6 +787,14 @@
       <w:pPr>
         <w:spacing w:line="240" w:lineRule="auto"/>
         <w:rPr>
+          <w:lang w:val="en-US"/>
+        </w:rPr>
+      </w:pPr>
+    </w:p>
+    <w:p>
+      <w:pPr>
+        <w:spacing w:line="240" w:lineRule="auto"/>
+        <w:rPr>
           <w:rFonts w:ascii="Segoe UI Emoji" w:hAnsi="Segoe UI Emoji" w:cs="Segoe UI Emoji"/>
           <w:b/>
           <w:bCs/>
@@ -395,34 +805,73 @@
       <w:pPr>
         <w:spacing w:line="240" w:lineRule="auto"/>
         <w:rPr>
-          <w:b/>
-          <w:bCs/>
-        </w:rPr>
-      </w:pPr>
-      <w:r>
-        <w:rPr>
           <w:rFonts w:ascii="Segoe UI Emoji" w:hAnsi="Segoe UI Emoji" w:cs="Segoe UI Emoji"/>
           <w:b/>
           <w:bCs/>
         </w:rPr>
+      </w:pPr>
+    </w:p>
+    <w:p>
+      <w:pPr>
+        <w:spacing w:line="240" w:lineRule="auto"/>
+        <w:jc w:val="center"/>
+        <w:rPr>
+          <w:b/>
+          <w:bCs/>
+          <w:sz w:val="36"/>
+          <w:szCs w:val="32"/>
+        </w:rPr>
+      </w:pPr>
+      <w:r>
+        <w:rPr>
+          <w:rFonts w:ascii="Segoe UI Emoji" w:hAnsi="Segoe UI Emoji" w:cs="Segoe UI Emoji"/>
+          <w:b/>
+          <w:bCs/>
+          <w:sz w:val="36"/>
+          <w:szCs w:val="32"/>
+        </w:rPr>
+        <w:lastRenderedPageBreak/>
         <w:t>🏛️</w:t>
       </w:r>
       <w:r>
         <w:rPr>
           <w:b/>
           <w:bCs/>
-        </w:rPr>
-        <w:t xml:space="preserve"> WHISKY Vault | Project Showcase Script</w:t>
+          <w:sz w:val="36"/>
+          <w:szCs w:val="32"/>
+        </w:rPr>
+        <w:t xml:space="preserve"> WHISKY Vault | Showcase Script</w:t>
       </w:r>
     </w:p>
     <w:p>
       <w:pPr>
         <w:spacing w:line="240" w:lineRule="auto"/>
-        <w:rPr>
-          <w:b/>
-          <w:bCs/>
-        </w:rPr>
-      </w:pPr>
+        <w:jc w:val="center"/>
+        <w:rPr>
+          <w:b/>
+          <w:bCs/>
+          <w:sz w:val="22"/>
+          <w:szCs w:val="20"/>
+        </w:rPr>
+      </w:pPr>
+      <w:r>
+        <w:rPr>
+          <w:b/>
+          <w:bCs/>
+          <w:sz w:val="22"/>
+          <w:szCs w:val="20"/>
+        </w:rPr>
+        <w:t>What to expect when navigating The WHISKY Va</w:t>
+      </w:r>
+      <w:r>
+        <w:rPr>
+          <w:b/>
+          <w:bCs/>
+          <w:sz w:val="22"/>
+          <w:szCs w:val="20"/>
+        </w:rPr>
+        <w:t>ult.</w:t>
+      </w:r>
     </w:p>
     <w:p>
       <w:pPr>
@@ -437,7 +886,21 @@
           <w:b/>
           <w:bCs/>
         </w:rPr>
-        <w:t>1. The Grand Entry (Branding &amp; Navigation)</w:t>
+        <w:t>1. The Grand Entry (</w:t>
+      </w:r>
+      <w:r>
+        <w:rPr>
+          <w:b/>
+          <w:bCs/>
+        </w:rPr>
+        <w:t>Action</w:t>
+      </w:r>
+      <w:r>
+        <w:rPr>
+          <w:b/>
+          <w:bCs/>
+        </w:rPr>
+        <w:t xml:space="preserve"> &amp; Navigation)</w:t>
       </w:r>
     </w:p>
     <w:p>
@@ -472,7 +935,14 @@
           <w:b/>
           <w:bCs/>
         </w:rPr>
-        <w:t>Narrative:</w:t>
+        <w:t>WHISKY</w:t>
+      </w:r>
+      <w:r>
+        <w:rPr>
+          <w:b/>
+          <w:bCs/>
+        </w:rPr>
+        <w:t>:</w:t>
       </w:r>
       <w:r>
         <w:t xml:space="preserve"> </w:t>
@@ -517,7 +987,14 @@
           <w:b/>
           <w:bCs/>
         </w:rPr>
-        <w:t>Narrative:</w:t>
+        <w:t>WHISKY</w:t>
+      </w:r>
+      <w:r>
+        <w:rPr>
+          <w:b/>
+          <w:bCs/>
+        </w:rPr>
+        <w:t>:</w:t>
       </w:r>
       <w:r>
         <w:t xml:space="preserve"> </w:t>
@@ -527,23 +1004,35 @@
           <w:i/>
           <w:iCs/>
         </w:rPr>
-        <w:t xml:space="preserve">"Our navigation is structured for elite curation, featuring Daily Recipes, Health &amp; Diet, and Holiday archives, all accessible via these blurred </w:t>
-      </w:r>
-      <w:proofErr w:type="spellStart"/>
+        <w:t>"Our navigation is structured for elite curation, featuring Daily Recipes, Health &amp; Diet, and Holiday archives, all accessible via these dropdowns</w:t>
+      </w:r>
       <w:r>
         <w:rPr>
           <w:i/>
           <w:iCs/>
         </w:rPr>
-        <w:t>glassmorphism</w:t>
-      </w:r>
-      <w:proofErr w:type="spellEnd"/>
+        <w:t xml:space="preserve"> menus</w:t>
+      </w:r>
       <w:r>
         <w:rPr>
           <w:i/>
           <w:iCs/>
         </w:rPr>
-        <w:t xml:space="preserve"> dropdowns."</w:t>
+        <w:t>.</w:t>
+      </w:r>
+      <w:r>
+        <w:rPr>
+          <w:i/>
+          <w:iCs/>
+        </w:rPr>
+        <w:t xml:space="preserve"> </w:t>
+      </w:r>
+      <w:r>
+        <w:rPr>
+          <w:i/>
+          <w:iCs/>
+        </w:rPr>
+        <w:t>Click a 'Daily Recipe' link like 'Dinner'</w:t>
       </w:r>
     </w:p>
     <w:p>
@@ -594,7 +1083,14 @@
           <w:b/>
           <w:bCs/>
         </w:rPr>
-        <w:t>Narrative:</w:t>
+        <w:t>WHISKY</w:t>
+      </w:r>
+      <w:r>
+        <w:rPr>
+          <w:b/>
+          <w:bCs/>
+        </w:rPr>
+        <w:t>:</w:t>
       </w:r>
       <w:r>
         <w:t xml:space="preserve"> </w:t>
@@ -604,7 +1100,35 @@
           <w:i/>
           <w:iCs/>
         </w:rPr>
-        <w:t>"To build community trust, we’ve integrated a feedback section featuring testimonials from our global users, ensuring the archive feels lived-in and credible."</w:t>
+        <w:t>"</w:t>
+      </w:r>
+      <w:r>
+        <w:rPr>
+          <w:i/>
+          <w:iCs/>
+        </w:rPr>
+        <w:t>In</w:t>
+      </w:r>
+      <w:r>
+        <w:rPr>
+          <w:i/>
+          <w:iCs/>
+        </w:rPr>
+        <w:t xml:space="preserve"> build</w:t>
+      </w:r>
+      <w:r>
+        <w:rPr>
+          <w:i/>
+          <w:iCs/>
+        </w:rPr>
+        <w:t>ing</w:t>
+      </w:r>
+      <w:r>
+        <w:rPr>
+          <w:i/>
+          <w:iCs/>
+        </w:rPr>
+        <w:t xml:space="preserve"> community, we’ve integrated a feedback section featuring testimonials from our global users, ensuring the archive feels lived-in and credible."</w:t>
       </w:r>
     </w:p>
     <w:p>
@@ -639,7 +1163,14 @@
           <w:b/>
           <w:bCs/>
         </w:rPr>
-        <w:t>Narrative:</w:t>
+        <w:t>WHISKY</w:t>
+      </w:r>
+      <w:r>
+        <w:rPr>
+          <w:b/>
+          <w:bCs/>
+        </w:rPr>
+        <w:t>:</w:t>
       </w:r>
       <w:r>
         <w:t xml:space="preserve"> </w:t>
@@ -700,7 +1231,14 @@
           <w:b/>
           <w:bCs/>
         </w:rPr>
-        <w:t>Narrative:</w:t>
+        <w:t>WHISKY</w:t>
+      </w:r>
+      <w:r>
+        <w:rPr>
+          <w:b/>
+          <w:bCs/>
+        </w:rPr>
+        <w:t>:</w:t>
       </w:r>
       <w:r>
         <w:t xml:space="preserve"> </w:t>
@@ -710,7 +1248,7 @@
           <w:i/>
           <w:iCs/>
         </w:rPr>
-        <w:t>"The Vault utilizes a secure Django authentication system. Once an archivist is logged in, the interface shifts to allow content management."</w:t>
+        <w:t>"Once an archivist is logged in, the interface shifts to allow content management."</w:t>
       </w:r>
     </w:p>
     <w:p>
@@ -745,7 +1283,14 @@
           <w:b/>
           <w:bCs/>
         </w:rPr>
-        <w:t>Narrative:</w:t>
+        <w:t>WHISKY</w:t>
+      </w:r>
+      <w:r>
+        <w:rPr>
+          <w:b/>
+          <w:bCs/>
+        </w:rPr>
+        <w:t>:</w:t>
       </w:r>
       <w:r>
         <w:t xml:space="preserve"> </w:t>
@@ -790,7 +1335,14 @@
           <w:b/>
           <w:bCs/>
         </w:rPr>
-        <w:t>Narrative:</w:t>
+        <w:t>WHISKY</w:t>
+      </w:r>
+      <w:r>
+        <w:rPr>
+          <w:b/>
+          <w:bCs/>
+        </w:rPr>
+        <w:t>:</w:t>
       </w:r>
       <w:r>
         <w:t xml:space="preserve"> </w:t>
@@ -851,8 +1403,14 @@
           <w:b/>
           <w:bCs/>
         </w:rPr>
-        <w:lastRenderedPageBreak/>
-        <w:t>Narrative:</w:t>
+        <w:t>WHISKY</w:t>
+      </w:r>
+      <w:r>
+        <w:rPr>
+          <w:b/>
+          <w:bCs/>
+        </w:rPr>
+        <w:t>:</w:t>
       </w:r>
       <w:r>
         <w:t xml:space="preserve"> </w:t>
@@ -862,23 +1420,7 @@
           <w:i/>
           <w:iCs/>
         </w:rPr>
-        <w:t xml:space="preserve">"Our advanced search functionality allows for instant discovery. Notice the </w:t>
-      </w:r>
-      <w:proofErr w:type="spellStart"/>
-      <w:r>
-        <w:rPr>
-          <w:i/>
-          <w:iCs/>
-        </w:rPr>
-        <w:t>glassmorphism</w:t>
-      </w:r>
-      <w:proofErr w:type="spellEnd"/>
-      <w:r>
-        <w:rPr>
-          <w:i/>
-          <w:iCs/>
-        </w:rPr>
-        <w:t xml:space="preserve"> design that keeps the focus on the culinary imagery while filtering the database."</w:t>
+        <w:t>"Our advanced search functionality allows for instant discovery. Notice the design that keeps the focus on the culinary imagery while filtering the database."</w:t>
       </w:r>
     </w:p>
     <w:p>
@@ -913,7 +1455,14 @@
           <w:b/>
           <w:bCs/>
         </w:rPr>
-        <w:t>Narrative:</w:t>
+        <w:t>WHISKY</w:t>
+      </w:r>
+      <w:r>
+        <w:rPr>
+          <w:b/>
+          <w:bCs/>
+        </w:rPr>
+        <w:t>:</w:t>
       </w:r>
       <w:r>
         <w:t xml:space="preserve"> </w:t>
@@ -923,7 +1472,7 @@
           <w:i/>
           <w:iCs/>
         </w:rPr>
-        <w:t>"Clicking any category redirects the user to a filtered archive shelf, displaying at least three high-quality records per category as per Phase 1 requirements."</w:t>
+        <w:t>"Clicking any category redirects the user to a filtered archive shelf, displaying high-quality records"</w:t>
       </w:r>
     </w:p>
     <w:p>
@@ -949,13 +1498,25 @@
           <w:numId w:val="13"/>
         </w:numPr>
         <w:spacing w:line="240" w:lineRule="auto"/>
-      </w:pPr>
-      <w:r>
-        <w:rPr>
-          <w:b/>
-          <w:bCs/>
-        </w:rPr>
-        <w:t>Narrative:</w:t>
+        <w:rPr>
+          <w:sz w:val="28"/>
+          <w:szCs w:val="24"/>
+          <w:lang w:val="en-US"/>
+        </w:rPr>
+      </w:pPr>
+      <w:r>
+        <w:rPr>
+          <w:b/>
+          <w:bCs/>
+        </w:rPr>
+        <w:t>WHISKY</w:t>
+      </w:r>
+      <w:r>
+        <w:rPr>
+          <w:b/>
+          <w:bCs/>
+        </w:rPr>
+        <w:t>:</w:t>
       </w:r>
       <w:r>
         <w:t xml:space="preserve"> </w:t>
@@ -965,20 +1526,56 @@
           <w:i/>
           <w:iCs/>
         </w:rPr>
-        <w:t>"By combining Django’s robust backend with a modern, responsive frontend, the WHISKY Vault stands as a sophisticated repository for food lovers worldwide. The project is fully version-controlled on GitHub and supported by comprehensive user documentation."</w:t>
-      </w:r>
-    </w:p>
-    <w:p>
-      <w:pPr>
-        <w:spacing w:line="240" w:lineRule="auto"/>
-        <w:rPr>
-          <w:lang w:val="en-US"/>
-        </w:rPr>
-      </w:pPr>
+        <w:t xml:space="preserve">"By combining Django’s robust backend with a modern, responsive </w:t>
+      </w:r>
+      <w:proofErr w:type="gramStart"/>
+      <w:r>
+        <w:rPr>
+          <w:i/>
+          <w:iCs/>
+        </w:rPr>
+        <w:t xml:space="preserve">frontend, </w:t>
+      </w:r>
+      <w:r>
+        <w:rPr>
+          <w:i/>
+          <w:iCs/>
+        </w:rPr>
+        <w:t xml:space="preserve"> t</w:t>
+      </w:r>
+      <w:r>
+        <w:rPr>
+          <w:i/>
+          <w:iCs/>
+        </w:rPr>
+        <w:t>he</w:t>
+      </w:r>
+      <w:proofErr w:type="gramEnd"/>
+      <w:r>
+        <w:rPr>
+          <w:i/>
+          <w:iCs/>
+        </w:rPr>
+        <w:t xml:space="preserve"> WHISKY Vault stands as a sophisticated repository for food lovers worldwide. The </w:t>
+      </w:r>
+      <w:r>
+        <w:rPr>
+          <w:i/>
+          <w:iCs/>
+        </w:rPr>
+        <w:t>project</w:t>
+      </w:r>
+      <w:r>
+        <w:rPr>
+          <w:i/>
+          <w:iCs/>
+        </w:rPr>
+        <w:t xml:space="preserve"> is fully version-controlled on GitHub and supported by comprehensive user documentation."</w:t>
+      </w:r>
     </w:p>
     <w:sectPr>
       <w:pgSz w:w="11906" w:h="16838"/>
-      <w:pgMar w:top="1440" w:right="1440" w:bottom="1440" w:left="1440" w:header="708" w:footer="708" w:gutter="0"/>
+      <w:pgMar w:top="720" w:right="720" w:bottom="720" w:left="720" w:header="708" w:footer="708" w:gutter="0"/>
       <w:pgNumType w:start="0"/>
       <w:cols w:space="708"/>
       <w:titlePg/>
@@ -1551,6 +2148,304 @@
     </w:lvl>
   </w:abstractNum>
   <w:abstractNum w:abstractNumId="4" w15:restartNumberingAfterBreak="0">
+    <w:nsid w:val="166433CA"/>
+    <w:multiLevelType w:val="multilevel"/>
+    <w:tmpl w:val="10B2DA42"/>
+    <w:lvl w:ilvl="0">
+      <w:start w:val="1"/>
+      <w:numFmt w:val="bullet"/>
+      <w:lvlText w:val=""/>
+      <w:lvlJc w:val="left"/>
+      <w:pPr>
+        <w:tabs>
+          <w:tab w:val="num" w:pos="720"/>
+        </w:tabs>
+        <w:ind w:left="720" w:hanging="360"/>
+      </w:pPr>
+      <w:rPr>
+        <w:rFonts w:ascii="Wingdings" w:hAnsi="Wingdings" w:hint="default"/>
+        <w:sz w:val="20"/>
+      </w:rPr>
+    </w:lvl>
+    <w:lvl w:ilvl="1" w:tentative="1">
+      <w:start w:val="1"/>
+      <w:numFmt w:val="bullet"/>
+      <w:lvlText w:val="o"/>
+      <w:lvlJc w:val="left"/>
+      <w:pPr>
+        <w:tabs>
+          <w:tab w:val="num" w:pos="1440"/>
+        </w:tabs>
+        <w:ind w:left="1440" w:hanging="360"/>
+      </w:pPr>
+      <w:rPr>
+        <w:rFonts w:ascii="Courier New" w:hAnsi="Courier New" w:hint="default"/>
+        <w:sz w:val="20"/>
+      </w:rPr>
+    </w:lvl>
+    <w:lvl w:ilvl="2" w:tentative="1">
+      <w:start w:val="1"/>
+      <w:numFmt w:val="bullet"/>
+      <w:lvlText w:val=""/>
+      <w:lvlJc w:val="left"/>
+      <w:pPr>
+        <w:tabs>
+          <w:tab w:val="num" w:pos="2160"/>
+        </w:tabs>
+        <w:ind w:left="2160" w:hanging="360"/>
+      </w:pPr>
+      <w:rPr>
+        <w:rFonts w:ascii="Wingdings" w:hAnsi="Wingdings" w:hint="default"/>
+        <w:sz w:val="20"/>
+      </w:rPr>
+    </w:lvl>
+    <w:lvl w:ilvl="3" w:tentative="1">
+      <w:start w:val="1"/>
+      <w:numFmt w:val="bullet"/>
+      <w:lvlText w:val=""/>
+      <w:lvlJc w:val="left"/>
+      <w:pPr>
+        <w:tabs>
+          <w:tab w:val="num" w:pos="2880"/>
+        </w:tabs>
+        <w:ind w:left="2880" w:hanging="360"/>
+      </w:pPr>
+      <w:rPr>
+        <w:rFonts w:ascii="Wingdings" w:hAnsi="Wingdings" w:hint="default"/>
+        <w:sz w:val="20"/>
+      </w:rPr>
+    </w:lvl>
+    <w:lvl w:ilvl="4" w:tentative="1">
+      <w:start w:val="1"/>
+      <w:numFmt w:val="bullet"/>
+      <w:lvlText w:val=""/>
+      <w:lvlJc w:val="left"/>
+      <w:pPr>
+        <w:tabs>
+          <w:tab w:val="num" w:pos="3600"/>
+        </w:tabs>
+        <w:ind w:left="3600" w:hanging="360"/>
+      </w:pPr>
+      <w:rPr>
+        <w:rFonts w:ascii="Wingdings" w:hAnsi="Wingdings" w:hint="default"/>
+        <w:sz w:val="20"/>
+      </w:rPr>
+    </w:lvl>
+    <w:lvl w:ilvl="5" w:tentative="1">
+      <w:start w:val="1"/>
+      <w:numFmt w:val="bullet"/>
+      <w:lvlText w:val=""/>
+      <w:lvlJc w:val="left"/>
+      <w:pPr>
+        <w:tabs>
+          <w:tab w:val="num" w:pos="4320"/>
+        </w:tabs>
+        <w:ind w:left="4320" w:hanging="360"/>
+      </w:pPr>
+      <w:rPr>
+        <w:rFonts w:ascii="Wingdings" w:hAnsi="Wingdings" w:hint="default"/>
+        <w:sz w:val="20"/>
+      </w:rPr>
+    </w:lvl>
+    <w:lvl w:ilvl="6" w:tentative="1">
+      <w:start w:val="1"/>
+      <w:numFmt w:val="bullet"/>
+      <w:lvlText w:val=""/>
+      <w:lvlJc w:val="left"/>
+      <w:pPr>
+        <w:tabs>
+          <w:tab w:val="num" w:pos="5040"/>
+        </w:tabs>
+        <w:ind w:left="5040" w:hanging="360"/>
+      </w:pPr>
+      <w:rPr>
+        <w:rFonts w:ascii="Wingdings" w:hAnsi="Wingdings" w:hint="default"/>
+        <w:sz w:val="20"/>
+      </w:rPr>
+    </w:lvl>
+    <w:lvl w:ilvl="7" w:tentative="1">
+      <w:start w:val="1"/>
+      <w:numFmt w:val="bullet"/>
+      <w:lvlText w:val=""/>
+      <w:lvlJc w:val="left"/>
+      <w:pPr>
+        <w:tabs>
+          <w:tab w:val="num" w:pos="5760"/>
+        </w:tabs>
+        <w:ind w:left="5760" w:hanging="360"/>
+      </w:pPr>
+      <w:rPr>
+        <w:rFonts w:ascii="Wingdings" w:hAnsi="Wingdings" w:hint="default"/>
+        <w:sz w:val="20"/>
+      </w:rPr>
+    </w:lvl>
+    <w:lvl w:ilvl="8" w:tentative="1">
+      <w:start w:val="1"/>
+      <w:numFmt w:val="bullet"/>
+      <w:lvlText w:val=""/>
+      <w:lvlJc w:val="left"/>
+      <w:pPr>
+        <w:tabs>
+          <w:tab w:val="num" w:pos="6480"/>
+        </w:tabs>
+        <w:ind w:left="6480" w:hanging="360"/>
+      </w:pPr>
+      <w:rPr>
+        <w:rFonts w:ascii="Wingdings" w:hAnsi="Wingdings" w:hint="default"/>
+        <w:sz w:val="20"/>
+      </w:rPr>
+    </w:lvl>
+  </w:abstractNum>
+  <w:abstractNum w:abstractNumId="5" w15:restartNumberingAfterBreak="0">
+    <w:nsid w:val="1B745651"/>
+    <w:multiLevelType w:val="multilevel"/>
+    <w:tmpl w:val="34F27982"/>
+    <w:lvl w:ilvl="0">
+      <w:start w:val="1"/>
+      <w:numFmt w:val="bullet"/>
+      <w:lvlText w:val=""/>
+      <w:lvlJc w:val="left"/>
+      <w:pPr>
+        <w:tabs>
+          <w:tab w:val="num" w:pos="720"/>
+        </w:tabs>
+        <w:ind w:left="720" w:hanging="360"/>
+      </w:pPr>
+      <w:rPr>
+        <w:rFonts w:ascii="Symbol" w:hAnsi="Symbol" w:hint="default"/>
+        <w:sz w:val="20"/>
+      </w:rPr>
+    </w:lvl>
+    <w:lvl w:ilvl="1" w:tentative="1">
+      <w:start w:val="1"/>
+      <w:numFmt w:val="bullet"/>
+      <w:lvlText w:val="o"/>
+      <w:lvlJc w:val="left"/>
+      <w:pPr>
+        <w:tabs>
+          <w:tab w:val="num" w:pos="1440"/>
+        </w:tabs>
+        <w:ind w:left="1440" w:hanging="360"/>
+      </w:pPr>
+      <w:rPr>
+        <w:rFonts w:ascii="Courier New" w:hAnsi="Courier New" w:hint="default"/>
+        <w:sz w:val="20"/>
+      </w:rPr>
+    </w:lvl>
+    <w:lvl w:ilvl="2" w:tentative="1">
+      <w:start w:val="1"/>
+      <w:numFmt w:val="bullet"/>
+      <w:lvlText w:val=""/>
+      <w:lvlJc w:val="left"/>
+      <w:pPr>
+        <w:tabs>
+          <w:tab w:val="num" w:pos="2160"/>
+        </w:tabs>
+        <w:ind w:left="2160" w:hanging="360"/>
+      </w:pPr>
+      <w:rPr>
+        <w:rFonts w:ascii="Wingdings" w:hAnsi="Wingdings" w:hint="default"/>
+        <w:sz w:val="20"/>
+      </w:rPr>
+    </w:lvl>
+    <w:lvl w:ilvl="3" w:tentative="1">
+      <w:start w:val="1"/>
+      <w:numFmt w:val="bullet"/>
+      <w:lvlText w:val=""/>
+      <w:lvlJc w:val="left"/>
+      <w:pPr>
+        <w:tabs>
+          <w:tab w:val="num" w:pos="2880"/>
+        </w:tabs>
+        <w:ind w:left="2880" w:hanging="360"/>
+      </w:pPr>
+      <w:rPr>
+        <w:rFonts w:ascii="Wingdings" w:hAnsi="Wingdings" w:hint="default"/>
+        <w:sz w:val="20"/>
+      </w:rPr>
+    </w:lvl>
+    <w:lvl w:ilvl="4" w:tentative="1">
+      <w:start w:val="1"/>
+      <w:numFmt w:val="bullet"/>
+      <w:lvlText w:val=""/>
+      <w:lvlJc w:val="left"/>
+      <w:pPr>
+        <w:tabs>
+          <w:tab w:val="num" w:pos="3600"/>
+        </w:tabs>
+        <w:ind w:left="3600" w:hanging="360"/>
+      </w:pPr>
+      <w:rPr>
+        <w:rFonts w:ascii="Wingdings" w:hAnsi="Wingdings" w:hint="default"/>
+        <w:sz w:val="20"/>
+      </w:rPr>
+    </w:lvl>
+    <w:lvl w:ilvl="5" w:tentative="1">
+      <w:start w:val="1"/>
+      <w:numFmt w:val="bullet"/>
+      <w:lvlText w:val=""/>
+      <w:lvlJc w:val="left"/>
+      <w:pPr>
+        <w:tabs>
+          <w:tab w:val="num" w:pos="4320"/>
+        </w:tabs>
+        <w:ind w:left="4320" w:hanging="360"/>
+      </w:pPr>
+      <w:rPr>
+        <w:rFonts w:ascii="Wingdings" w:hAnsi="Wingdings" w:hint="default"/>
+        <w:sz w:val="20"/>
+      </w:rPr>
+    </w:lvl>
+    <w:lvl w:ilvl="6" w:tentative="1">
+      <w:start w:val="1"/>
+      <w:numFmt w:val="bullet"/>
+      <w:lvlText w:val=""/>
+      <w:lvlJc w:val="left"/>
+      <w:pPr>
+        <w:tabs>
+          <w:tab w:val="num" w:pos="5040"/>
+        </w:tabs>
+        <w:ind w:left="5040" w:hanging="360"/>
+      </w:pPr>
+      <w:rPr>
+        <w:rFonts w:ascii="Wingdings" w:hAnsi="Wingdings" w:hint="default"/>
+        <w:sz w:val="20"/>
+      </w:rPr>
+    </w:lvl>
+    <w:lvl w:ilvl="7" w:tentative="1">
+      <w:start w:val="1"/>
+      <w:numFmt w:val="bullet"/>
+      <w:lvlText w:val=""/>
+      <w:lvlJc w:val="left"/>
+      <w:pPr>
+        <w:tabs>
+          <w:tab w:val="num" w:pos="5760"/>
+        </w:tabs>
+        <w:ind w:left="5760" w:hanging="360"/>
+      </w:pPr>
+      <w:rPr>
+        <w:rFonts w:ascii="Wingdings" w:hAnsi="Wingdings" w:hint="default"/>
+        <w:sz w:val="20"/>
+      </w:rPr>
+    </w:lvl>
+    <w:lvl w:ilvl="8" w:tentative="1">
+      <w:start w:val="1"/>
+      <w:numFmt w:val="bullet"/>
+      <w:lvlText w:val=""/>
+      <w:lvlJc w:val="left"/>
+      <w:pPr>
+        <w:tabs>
+          <w:tab w:val="num" w:pos="6480"/>
+        </w:tabs>
+        <w:ind w:left="6480" w:hanging="360"/>
+      </w:pPr>
+      <w:rPr>
+        <w:rFonts w:ascii="Wingdings" w:hAnsi="Wingdings" w:hint="default"/>
+        <w:sz w:val="20"/>
+      </w:rPr>
+    </w:lvl>
+  </w:abstractNum>
+  <w:abstractNum w:abstractNumId="6" w15:restartNumberingAfterBreak="0">
     <w:nsid w:val="240503BD"/>
     <w:multiLevelType w:val="multilevel"/>
     <w:tmpl w:val="3F505232"/>
@@ -1699,7 +2594,7 @@
       </w:rPr>
     </w:lvl>
   </w:abstractNum>
-  <w:abstractNum w:abstractNumId="5" w15:restartNumberingAfterBreak="0">
+  <w:abstractNum w:abstractNumId="7" w15:restartNumberingAfterBreak="0">
     <w:nsid w:val="26A36500"/>
     <w:multiLevelType w:val="multilevel"/>
     <w:tmpl w:val="E6A0329C"/>
@@ -1848,7 +2743,7 @@
       </w:rPr>
     </w:lvl>
   </w:abstractNum>
-  <w:abstractNum w:abstractNumId="6" w15:restartNumberingAfterBreak="0">
+  <w:abstractNum w:abstractNumId="8" w15:restartNumberingAfterBreak="0">
     <w:nsid w:val="2B1F1076"/>
     <w:multiLevelType w:val="hybridMultilevel"/>
     <w:tmpl w:val="7F5A312A"/>
@@ -1934,7 +2829,7 @@
       </w:pPr>
     </w:lvl>
   </w:abstractNum>
-  <w:abstractNum w:abstractNumId="7" w15:restartNumberingAfterBreak="0">
+  <w:abstractNum w:abstractNumId="9" w15:restartNumberingAfterBreak="0">
     <w:nsid w:val="52C63F06"/>
     <w:multiLevelType w:val="multilevel"/>
     <w:tmpl w:val="F96420AA"/>
@@ -2083,7 +2978,7 @@
       </w:rPr>
     </w:lvl>
   </w:abstractNum>
-  <w:abstractNum w:abstractNumId="8" w15:restartNumberingAfterBreak="0">
+  <w:abstractNum w:abstractNumId="10" w15:restartNumberingAfterBreak="0">
     <w:nsid w:val="55A72D5D"/>
     <w:multiLevelType w:val="hybridMultilevel"/>
     <w:tmpl w:val="09E2A0BC"/>
@@ -2196,7 +3091,120 @@
       </w:rPr>
     </w:lvl>
   </w:abstractNum>
-  <w:abstractNum w:abstractNumId="9" w15:restartNumberingAfterBreak="0">
+  <w:abstractNum w:abstractNumId="11" w15:restartNumberingAfterBreak="0">
+    <w:nsid w:val="5D670040"/>
+    <w:multiLevelType w:val="hybridMultilevel"/>
+    <w:tmpl w:val="5574BC62"/>
+    <w:lvl w:ilvl="0" w:tplc="14090003">
+      <w:start w:val="1"/>
+      <w:numFmt w:val="bullet"/>
+      <w:lvlText w:val="o"/>
+      <w:lvlJc w:val="left"/>
+      <w:pPr>
+        <w:ind w:left="1440" w:hanging="360"/>
+      </w:pPr>
+      <w:rPr>
+        <w:rFonts w:ascii="Courier New" w:hAnsi="Courier New" w:cs="Courier New" w:hint="default"/>
+      </w:rPr>
+    </w:lvl>
+    <w:lvl w:ilvl="1" w:tplc="14090003" w:tentative="1">
+      <w:start w:val="1"/>
+      <w:numFmt w:val="bullet"/>
+      <w:lvlText w:val="o"/>
+      <w:lvlJc w:val="left"/>
+      <w:pPr>
+        <w:ind w:left="2160" w:hanging="360"/>
+      </w:pPr>
+      <w:rPr>
+        <w:rFonts w:ascii="Courier New" w:hAnsi="Courier New" w:cs="Courier New" w:hint="default"/>
+      </w:rPr>
+    </w:lvl>
+    <w:lvl w:ilvl="2" w:tplc="14090005" w:tentative="1">
+      <w:start w:val="1"/>
+      <w:numFmt w:val="bullet"/>
+      <w:lvlText w:val=""/>
+      <w:lvlJc w:val="left"/>
+      <w:pPr>
+        <w:ind w:left="2880" w:hanging="360"/>
+      </w:pPr>
+      <w:rPr>
+        <w:rFonts w:ascii="Wingdings" w:hAnsi="Wingdings" w:hint="default"/>
+      </w:rPr>
+    </w:lvl>
+    <w:lvl w:ilvl="3" w:tplc="14090001" w:tentative="1">
+      <w:start w:val="1"/>
+      <w:numFmt w:val="bullet"/>
+      <w:lvlText w:val=""/>
+      <w:lvlJc w:val="left"/>
+      <w:pPr>
+        <w:ind w:left="3600" w:hanging="360"/>
+      </w:pPr>
+      <w:rPr>
+        <w:rFonts w:ascii="Symbol" w:hAnsi="Symbol" w:hint="default"/>
+      </w:rPr>
+    </w:lvl>
+    <w:lvl w:ilvl="4" w:tplc="14090003" w:tentative="1">
+      <w:start w:val="1"/>
+      <w:numFmt w:val="bullet"/>
+      <w:lvlText w:val="o"/>
+      <w:lvlJc w:val="left"/>
+      <w:pPr>
+        <w:ind w:left="4320" w:hanging="360"/>
+      </w:pPr>
+      <w:rPr>
+        <w:rFonts w:ascii="Courier New" w:hAnsi="Courier New" w:cs="Courier New" w:hint="default"/>
+      </w:rPr>
+    </w:lvl>
+    <w:lvl w:ilvl="5" w:tplc="14090005" w:tentative="1">
+      <w:start w:val="1"/>
+      <w:numFmt w:val="bullet"/>
+      <w:lvlText w:val=""/>
+      <w:lvlJc w:val="left"/>
+      <w:pPr>
+        <w:ind w:left="5040" w:hanging="360"/>
+      </w:pPr>
+      <w:rPr>
+        <w:rFonts w:ascii="Wingdings" w:hAnsi="Wingdings" w:hint="default"/>
+      </w:rPr>
+    </w:lvl>
+    <w:lvl w:ilvl="6" w:tplc="14090001" w:tentative="1">
+      <w:start w:val="1"/>
+      <w:numFmt w:val="bullet"/>
+      <w:lvlText w:val=""/>
+      <w:lvlJc w:val="left"/>
+      <w:pPr>
+        <w:ind w:left="5760" w:hanging="360"/>
+      </w:pPr>
+      <w:rPr>
+        <w:rFonts w:ascii="Symbol" w:hAnsi="Symbol" w:hint="default"/>
+      </w:rPr>
+    </w:lvl>
+    <w:lvl w:ilvl="7" w:tplc="14090003" w:tentative="1">
+      <w:start w:val="1"/>
+      <w:numFmt w:val="bullet"/>
+      <w:lvlText w:val="o"/>
+      <w:lvlJc w:val="left"/>
+      <w:pPr>
+        <w:ind w:left="6480" w:hanging="360"/>
+      </w:pPr>
+      <w:rPr>
+        <w:rFonts w:ascii="Courier New" w:hAnsi="Courier New" w:cs="Courier New" w:hint="default"/>
+      </w:rPr>
+    </w:lvl>
+    <w:lvl w:ilvl="8" w:tplc="14090005" w:tentative="1">
+      <w:start w:val="1"/>
+      <w:numFmt w:val="bullet"/>
+      <w:lvlText w:val=""/>
+      <w:lvlJc w:val="left"/>
+      <w:pPr>
+        <w:ind w:left="7200" w:hanging="360"/>
+      </w:pPr>
+      <w:rPr>
+        <w:rFonts w:ascii="Wingdings" w:hAnsi="Wingdings" w:hint="default"/>
+      </w:rPr>
+    </w:lvl>
+  </w:abstractNum>
+  <w:abstractNum w:abstractNumId="12" w15:restartNumberingAfterBreak="0">
     <w:nsid w:val="67F73FD7"/>
     <w:multiLevelType w:val="hybridMultilevel"/>
     <w:tmpl w:val="A63CB618"/>
@@ -2309,7 +3317,7 @@
       </w:rPr>
     </w:lvl>
   </w:abstractNum>
-  <w:abstractNum w:abstractNumId="10" w15:restartNumberingAfterBreak="0">
+  <w:abstractNum w:abstractNumId="13" w15:restartNumberingAfterBreak="0">
     <w:nsid w:val="6DA073E3"/>
     <w:multiLevelType w:val="multilevel"/>
     <w:tmpl w:val="443ABD48"/>
@@ -2458,7 +3466,7 @@
       </w:rPr>
     </w:lvl>
   </w:abstractNum>
-  <w:abstractNum w:abstractNumId="11" w15:restartNumberingAfterBreak="0">
+  <w:abstractNum w:abstractNumId="14" w15:restartNumberingAfterBreak="0">
     <w:nsid w:val="6E0A43A3"/>
     <w:multiLevelType w:val="hybridMultilevel"/>
     <w:tmpl w:val="FACAB6F0"/>
@@ -2571,7 +3579,7 @@
       </w:rPr>
     </w:lvl>
   </w:abstractNum>
-  <w:abstractNum w:abstractNumId="12" w15:restartNumberingAfterBreak="0">
+  <w:abstractNum w:abstractNumId="15" w15:restartNumberingAfterBreak="0">
     <w:nsid w:val="761716A3"/>
     <w:multiLevelType w:val="multilevel"/>
     <w:tmpl w:val="43B26294"/>
@@ -2721,22 +3729,22 @@
     </w:lvl>
   </w:abstractNum>
   <w:num w:numId="1" w16cid:durableId="1484589006">
-    <w:abstractNumId w:val="6"/>
+    <w:abstractNumId w:val="8"/>
   </w:num>
   <w:num w:numId="2" w16cid:durableId="1389184124">
     <w:abstractNumId w:val="3"/>
   </w:num>
   <w:num w:numId="3" w16cid:durableId="1401711289">
-    <w:abstractNumId w:val="11"/>
+    <w:abstractNumId w:val="14"/>
   </w:num>
   <w:num w:numId="4" w16cid:durableId="182744430">
-    <w:abstractNumId w:val="8"/>
+    <w:abstractNumId w:val="10"/>
   </w:num>
   <w:num w:numId="5" w16cid:durableId="1680277903">
-    <w:abstractNumId w:val="9"/>
+    <w:abstractNumId w:val="12"/>
   </w:num>
   <w:num w:numId="6" w16cid:durableId="1788154577">
-    <w:abstractNumId w:val="5"/>
+    <w:abstractNumId w:val="7"/>
   </w:num>
   <w:num w:numId="7" w16cid:durableId="19867106">
     <w:abstractNumId w:val="0"/>
@@ -2748,16 +3756,25 @@
     <w:abstractNumId w:val="1"/>
   </w:num>
   <w:num w:numId="10" w16cid:durableId="976837388">
-    <w:abstractNumId w:val="7"/>
+    <w:abstractNumId w:val="9"/>
   </w:num>
   <w:num w:numId="11" w16cid:durableId="1604000428">
-    <w:abstractNumId w:val="4"/>
+    <w:abstractNumId w:val="6"/>
   </w:num>
   <w:num w:numId="12" w16cid:durableId="1957327211">
-    <w:abstractNumId w:val="10"/>
+    <w:abstractNumId w:val="13"/>
   </w:num>
   <w:num w:numId="13" w16cid:durableId="427312712">
-    <w:abstractNumId w:val="12"/>
+    <w:abstractNumId w:val="15"/>
+  </w:num>
+  <w:num w:numId="14" w16cid:durableId="803616703">
+    <w:abstractNumId w:val="11"/>
+  </w:num>
+  <w:num w:numId="15" w16cid:durableId="2087877107">
+    <w:abstractNumId w:val="5"/>
+  </w:num>
+  <w:num w:numId="16" w16cid:durableId="400838220">
+    <w:abstractNumId w:val="4"/>
   </w:num>
 </w:numbering>
 </file>

</xml_diff>